<commit_message>
Word copy rebuilt to look like the compact PDF, with Source Serif 4 embedded
The first Word file was a separate design and was checked too thinly. It now
uses the PDF's sizes, margins, headings, captions and table rules, embeds the
body font, and has fixes for broken equations and split column headers.
26 pages; all pages read in a converted copy. Records updated.

Co-Authored-By: Claude Sonnet 5.5 <noreply@anthropic.com>
Claude-Session: https://claude.ai/code/session_01XxH9J9TaLYfAYFCaGAqS9y
</commit_message>
<xml_diff>
--- a/papers/thesis_2026-10/reading/docx_reference.docx
+++ b/papers/thesis_2026-10/reading/docx_reference.docx
@@ -385,7 +385,7 @@
     <w:sectPr>
       <w:footerReference w:type="default" r:id="rId9"/>
       <w:pgSz w:h="16838" w:w="11906"/>
-      <w:pgMar w:left="1247" w:right="1247" w:top="1247" w:bottom="1134"/>
+      <w:pgMar w:left="850" w:right="850" w:top="794" w:bottom="794" w:footer="340"/>
     </w:sectPr>
   </w:body>
 </w:document>
@@ -404,8 +404,8 @@
     </w:pPr>
     <w:r>
       <w:rPr>
-        <w:rFonts w:ascii="Times New Roman" w:hAnsi="Times New Roman"/>
-        <w:sz w:val="18"/>
+        <w:rFonts w:ascii="Source Serif 4" w:hAnsi="Source Serif 4"/>
+        <w:sz w:val="16"/>
       </w:rPr>
       <w:fldChar w:fldCharType="begin"/>
       <w:instrText xml:space="preserve"> PAGE </w:instrText>
@@ -588,13 +588,13 @@
     <w:name w:val="Normal"/>
     <w:qFormat/>
     <w:pPr>
-      <w:spacing w:line="259" w:lineRule="auto" w:after="80" w:before="0"/>
+      <w:spacing w:lineRule="exact" w:line="242" w:before="0" w:after="78"/>
       <w:jc w:val="both"/>
     </w:pPr>
     <w:rPr>
-      <w:rFonts w:ascii="Times New Roman" w:hAnsi="Times New Roman" w:cs="Times New Roman" w:eastAsia="Times New Roman"/>
-      <w:color w:val="000000"/>
-      <w:sz w:val="21"/>
+      <w:rFonts w:ascii="Source Serif 4" w:hAnsi="Source Serif 4" w:cs="Source Serif 4" w:eastAsia="Source Serif 4"/>
+      <w:color w:val="111111"/>
+      <w:sz w:val="18"/>
     </w:rPr>
   </w:style>
   <w:style w:type="paragraph" w:styleId="BodyText">
@@ -602,14 +602,14 @@
     <w:basedOn w:val="Normal"/>
     <w:link w:val="BodyTextChar"/>
     <w:pPr>
-      <w:spacing w:before="0" w:after="80" w:line="259" w:lineRule="auto"/>
+      <w:spacing w:before="0" w:after="78" w:lineRule="exact" w:line="242"/>
       <w:jc w:val="both"/>
     </w:pPr>
     <w:qFormat/>
     <w:rPr>
-      <w:rFonts w:ascii="Times New Roman" w:hAnsi="Times New Roman" w:cs="Times New Roman" w:eastAsia="Times New Roman"/>
-      <w:color w:val="000000"/>
-      <w:sz w:val="21"/>
+      <w:rFonts w:ascii="Source Serif 4" w:hAnsi="Source Serif 4" w:cs="Source Serif 4" w:eastAsia="Source Serif 4"/>
+      <w:color w:val="111111"/>
+      <w:sz w:val="18"/>
     </w:rPr>
   </w:style>
   <w:style w:type="paragraph" w:customStyle="1" w:styleId="FirstParagraph">
@@ -618,13 +618,13 @@
     <w:next w:val="BodyText"/>
     <w:qFormat/>
     <w:pPr>
-      <w:spacing w:line="259" w:lineRule="auto" w:after="80" w:before="0"/>
+      <w:spacing w:lineRule="exact" w:line="242" w:before="0" w:after="78"/>
       <w:jc w:val="both"/>
     </w:pPr>
     <w:rPr>
-      <w:rFonts w:ascii="Times New Roman" w:hAnsi="Times New Roman" w:cs="Times New Roman" w:eastAsia="Times New Roman"/>
-      <w:color w:val="000000"/>
-      <w:sz w:val="21"/>
+      <w:rFonts w:ascii="Source Serif 4" w:hAnsi="Source Serif 4" w:cs="Source Serif 4" w:eastAsia="Source Serif 4"/>
+      <w:color w:val="111111"/>
+      <w:sz w:val="18"/>
     </w:rPr>
   </w:style>
   <w:style w:type="paragraph" w:customStyle="1" w:styleId="Compact">
@@ -632,13 +632,13 @@
     <w:basedOn w:val="BodyText"/>
     <w:qFormat/>
     <w:pPr>
-      <w:spacing w:before="36" w:after="20"/>
+      <w:spacing w:before="0" w:after="20" w:lineRule="exact" w:line="242"/>
       <w:jc w:val="left"/>
     </w:pPr>
     <w:rPr>
-      <w:rFonts w:ascii="Times New Roman" w:hAnsi="Times New Roman" w:cs="Times New Roman" w:eastAsia="Times New Roman"/>
-      <w:color w:val="000000"/>
-      <w:sz w:val="21"/>
+      <w:rFonts w:ascii="Source Serif 4" w:hAnsi="Source Serif 4" w:cs="Source Serif 4" w:eastAsia="Source Serif 4"/>
+      <w:color w:val="111111"/>
+      <w:sz w:val="18"/>
     </w:rPr>
   </w:style>
   <w:style w:type="paragraph" w:styleId="Title">
@@ -649,15 +649,15 @@
     <w:pPr>
       <w:keepNext/>
       <w:keepLines/>
-      <w:spacing w:before="480" w:after="240"/>
-      <w:jc w:val="center"/>
-    </w:pPr>
-    <w:rPr>
-      <w:rFonts w:ascii="Times New Roman" w:hAnsi="Times New Roman" w:cs="Times New Roman" w:eastAsia="Times New Roman"/>
+      <w:spacing w:before="0" w:after="56" w:lineRule="exact" w:line="312"/>
+      <w:jc w:val="left"/>
+    </w:pPr>
+    <w:rPr>
+      <w:rFonts w:ascii="Source Serif 4" w:hAnsi="Source Serif 4" w:cs="Source Serif 4" w:eastAsia="Source Serif 4"/>
       <w:b/>
       <w:bCs/>
-      <w:color w:val="000000"/>
-      <w:sz w:val="34"/>
+      <w:color w:val="111111"/>
+      <w:sz w:val="24"/>
       <w:szCs w:val="36"/>
     </w:rPr>
   </w:style>
@@ -669,15 +669,18 @@
     <w:pPr>
       <w:keepNext/>
       <w:keepLines/>
-      <w:spacing w:before="240" w:after="240"/>
-      <w:jc w:val="center"/>
-    </w:pPr>
-    <w:rPr>
-      <w:rFonts w:ascii="Times New Roman" w:hAnsi="Times New Roman" w:cs="Times New Roman" w:eastAsia="Times New Roman"/>
+      <w:spacing w:before="0" w:after="220" w:lineRule="exact" w:line="232"/>
+      <w:jc w:val="left"/>
+      <w:pBdr>
+        <w:bottom w:val="single" w:sz="6" w:space="6" w:color="999999"/>
+      </w:pBdr>
+    </w:pPr>
+    <w:rPr>
+      <w:rFonts w:ascii="Source Serif 4" w:hAnsi="Source Serif 4" w:cs="Source Serif 4" w:eastAsia="Source Serif 4"/>
       <w:b w:val="0"/>
       <w:i/>
-      <w:color w:val="000000"/>
-      <w:sz w:val="23"/>
+      <w:color w:val="111111"/>
+      <w:sz w:val="18"/>
       <w:szCs w:val="30"/>
     </w:rPr>
   </w:style>
@@ -688,12 +691,13 @@
     <w:pPr>
       <w:keepNext/>
       <w:keepLines/>
-      <w:jc w:val="center"/>
-    </w:pPr>
-    <w:rPr>
-      <w:rFonts w:ascii="Times New Roman" w:hAnsi="Times New Roman" w:cs="Times New Roman" w:eastAsia="Times New Roman"/>
-      <w:color w:val="000000"/>
-      <w:sz w:val="21"/>
+      <w:spacing w:lineRule="exact" w:line="232" w:before="0" w:after="20"/>
+      <w:jc w:val="left"/>
+    </w:pPr>
+    <w:rPr>
+      <w:rFonts w:ascii="Source Serif 4" w:hAnsi="Source Serif 4" w:cs="Source Serif 4" w:eastAsia="Source Serif 4"/>
+      <w:color w:val="111111"/>
+      <w:sz w:val="18"/>
     </w:rPr>
   </w:style>
   <w:style w:type="paragraph" w:styleId="Date">
@@ -703,12 +707,13 @@
     <w:pPr>
       <w:keepNext/>
       <w:keepLines/>
-      <w:jc w:val="center"/>
-    </w:pPr>
-    <w:rPr>
-      <w:rFonts w:ascii="Times New Roman" w:hAnsi="Times New Roman" w:cs="Times New Roman" w:eastAsia="Times New Roman"/>
-      <w:color w:val="000000"/>
-      <w:sz w:val="21"/>
+      <w:spacing w:lineRule="exact" w:line="232" w:before="0" w:after="20"/>
+      <w:jc w:val="left"/>
+    </w:pPr>
+    <w:rPr>
+      <w:rFonts w:ascii="Source Serif 4" w:hAnsi="Source Serif 4" w:cs="Source Serif 4" w:eastAsia="Source Serif 4"/>
+      <w:color w:val="111111"/>
+      <w:sz w:val="18"/>
     </w:rPr>
   </w:style>
   <w:style w:type="paragraph" w:customStyle="1" w:styleId="AbstractTitle">
@@ -762,16 +767,17 @@
     <w:pPr>
       <w:keepNext/>
       <w:keepLines/>
-      <w:spacing w:before="280" w:after="120"/>
+      <w:spacing w:before="396" w:after="170" w:lineRule="exact" w:line="352"/>
+      <w:jc w:val="left"/>
       <w:outlineLvl w:val="0"/>
     </w:pPr>
     <w:rPr>
-      <w:rFonts w:ascii="Times New Roman" w:hAnsi="Times New Roman" w:cs="Times New Roman" w:eastAsia="Times New Roman"/>
+      <w:rFonts w:ascii="Source Serif 4" w:hAnsi="Source Serif 4" w:cs="Source Serif 4" w:eastAsia="Source Serif 4"/>
       <w:b/>
       <w:bCs/>
       <w:i w:val="0"/>
-      <w:color w:val="000000"/>
-      <w:sz w:val="30"/>
+      <w:color w:val="111111"/>
+      <w:sz w:val="27"/>
       <w:szCs w:val="32"/>
     </w:rPr>
   </w:style>
@@ -785,16 +791,17 @@
     <w:pPr>
       <w:keepNext/>
       <w:keepLines/>
-      <w:spacing w:before="200" w:after="60"/>
+      <w:spacing w:before="226" w:after="56" w:lineRule="exact" w:line="272"/>
+      <w:jc w:val="left"/>
       <w:outlineLvl w:val="1"/>
     </w:pPr>
     <w:rPr>
-      <w:rFonts w:ascii="Times New Roman" w:hAnsi="Times New Roman" w:cs="Times New Roman" w:eastAsia="Times New Roman"/>
+      <w:rFonts w:ascii="Source Serif 4" w:hAnsi="Source Serif 4" w:cs="Source Serif 4" w:eastAsia="Source Serif 4"/>
       <w:b/>
       <w:bCs/>
       <w:i w:val="0"/>
-      <w:color w:val="000000"/>
-      <w:sz w:val="25"/>
+      <w:color w:val="111111"/>
+      <w:sz w:val="21"/>
       <w:szCs w:val="28"/>
     </w:rPr>
   </w:style>
@@ -808,16 +815,17 @@
     <w:pPr>
       <w:keepNext/>
       <w:keepLines/>
-      <w:spacing w:before="120" w:after="40"/>
+      <w:spacing w:before="170" w:after="56" w:lineRule="exact" w:line="246"/>
+      <w:jc w:val="left"/>
       <w:outlineLvl w:val="2"/>
     </w:pPr>
     <w:rPr>
-      <w:rFonts w:ascii="Times New Roman" w:hAnsi="Times New Roman" w:cs="Times New Roman" w:eastAsia="Times New Roman"/>
+      <w:rFonts w:ascii="Source Serif 4" w:hAnsi="Source Serif 4" w:cs="Source Serif 4" w:eastAsia="Source Serif 4"/>
       <w:b/>
       <w:bCs/>
-      <w:i w:val="0"/>
-      <w:color w:val="000000"/>
-      <w:sz w:val="22"/>
+      <w:i/>
+      <w:color w:val="111111"/>
+      <w:sz w:val="19"/>
       <w:szCs w:val="24"/>
     </w:rPr>
   </w:style>
@@ -831,16 +839,17 @@
     <w:pPr>
       <w:keepNext/>
       <w:keepLines/>
-      <w:spacing w:before="200" w:after="0"/>
+      <w:spacing w:before="120" w:after="40" w:lineRule="exact" w:line="242"/>
+      <w:jc w:val="left"/>
       <w:outlineLvl w:val="3"/>
     </w:pPr>
     <w:rPr>
-      <w:rFonts w:ascii="Times New Roman" w:hAnsi="Times New Roman" w:cs="Times New Roman" w:eastAsia="Times New Roman"/>
+      <w:rFonts w:ascii="Source Serif 4" w:hAnsi="Source Serif 4" w:cs="Source Serif 4" w:eastAsia="Source Serif 4"/>
       <w:i w:val="0"/>
       <w:b/>
       <w:bCs/>
-      <w:color w:val="000000"/>
-      <w:sz w:val="21"/>
+      <w:color w:val="111111"/>
+      <w:sz w:val="18"/>
       <w:szCs w:val="24"/>
     </w:rPr>
   </w:style>
@@ -953,14 +962,14 @@
     <w:unhideWhenUsed/>
     <w:qFormat/>
     <w:pPr>
-      <w:spacing w:before="100" w:after="100"/>
-      <w:ind w:firstLine="0" w:left="454" w:right="480"/>
+      <w:spacing w:before="86" w:after="114" w:lineRule="exact" w:line="242"/>
+      <w:ind w:firstLine="0" w:left="454" w:right="454"/>
       <w:jc w:val="left"/>
     </w:pPr>
     <w:rPr>
-      <w:rFonts w:ascii="Times New Roman" w:hAnsi="Times New Roman" w:cs="Times New Roman" w:eastAsia="Times New Roman"/>
-      <w:color w:val="000000"/>
-      <w:sz w:val="21"/>
+      <w:rFonts w:ascii="Source Serif 4" w:hAnsi="Source Serif 4" w:cs="Source Serif 4" w:eastAsia="Source Serif 4"/>
+      <w:color w:val="111111"/>
+      <w:sz w:val="18"/>
     </w:rPr>
   </w:style>
   <w:style w:type="paragraph" w:styleId="FootnoteText">
@@ -970,10 +979,14 @@
     <w:uiPriority w:val="9"/>
     <w:unhideWhenUsed/>
     <w:qFormat/>
-    <w:rPr>
-      <w:rFonts w:ascii="Times New Roman" w:hAnsi="Times New Roman" w:cs="Times New Roman" w:eastAsia="Times New Roman"/>
-      <w:color w:val="000000"/>
-      <w:sz w:val="19"/>
+    <w:pPr>
+      <w:spacing w:lineRule="exact" w:line="216" w:before="0" w:after="20"/>
+      <w:jc w:val="left"/>
+    </w:pPr>
+    <w:rPr>
+      <w:rFonts w:ascii="Source Serif 4" w:hAnsi="Source Serif 4" w:cs="Source Serif 4" w:eastAsia="Source Serif 4"/>
+      <w:color w:val="111111"/>
+      <w:sz w:val="16"/>
     </w:rPr>
   </w:style>
   <w:style w:type="character" w:default="1" w:styleId="DefaultParagraphFont">
@@ -1034,14 +1047,15 @@
     <w:basedOn w:val="Normal"/>
     <w:link w:val="BodyTextChar"/>
     <w:pPr>
-      <w:spacing w:before="0" w:after="120"/>
-    </w:pPr>
-    <w:rPr>
-      <w:rFonts w:ascii="Times New Roman" w:hAnsi="Times New Roman" w:cs="Times New Roman" w:eastAsia="Times New Roman"/>
+      <w:spacing w:before="140" w:after="56" w:lineRule="exact" w:line="246"/>
+      <w:jc w:val="left"/>
+    </w:pPr>
+    <w:rPr>
+      <w:rFonts w:ascii="Source Serif 4" w:hAnsi="Source Serif 4" w:cs="Source Serif 4" w:eastAsia="Source Serif 4"/>
       <w:b w:val="0"/>
       <w:i w:val="0"/>
-      <w:color w:val="000000"/>
-      <w:sz w:val="20"/>
+      <w:color w:val="111111"/>
+      <w:sz w:val="17"/>
     </w:rPr>
   </w:style>
   <w:style w:type="paragraph" w:customStyle="1" w:styleId="TableCaption">
@@ -1049,24 +1063,30 @@
     <w:basedOn w:val="Caption"/>
     <w:pPr>
       <w:keepNext/>
-    </w:pPr>
-    <w:rPr>
-      <w:rFonts w:ascii="Times New Roman" w:hAnsi="Times New Roman" w:cs="Times New Roman" w:eastAsia="Times New Roman"/>
+      <w:spacing w:lineRule="exact" w:line="246" w:before="140" w:after="56"/>
+      <w:jc w:val="left"/>
+    </w:pPr>
+    <w:rPr>
+      <w:rFonts w:ascii="Source Serif 4" w:hAnsi="Source Serif 4" w:cs="Source Serif 4" w:eastAsia="Source Serif 4"/>
       <w:b w:val="0"/>
       <w:i w:val="0"/>
-      <w:color w:val="000000"/>
-      <w:sz w:val="20"/>
+      <w:color w:val="111111"/>
+      <w:sz w:val="17"/>
     </w:rPr>
   </w:style>
   <w:style w:type="paragraph" w:customStyle="1" w:styleId="ImageCaption">
     <w:name w:val="Image Caption"/>
     <w:basedOn w:val="Caption"/>
-    <w:rPr>
-      <w:rFonts w:ascii="Times New Roman" w:hAnsi="Times New Roman" w:cs="Times New Roman" w:eastAsia="Times New Roman"/>
+    <w:pPr>
+      <w:spacing w:lineRule="exact" w:line="246" w:before="140" w:after="56"/>
+      <w:jc w:val="left"/>
+    </w:pPr>
+    <w:rPr>
+      <w:rFonts w:ascii="Source Serif 4" w:hAnsi="Source Serif 4" w:cs="Source Serif 4" w:eastAsia="Source Serif 4"/>
       <w:b w:val="0"/>
       <w:i w:val="0"/>
-      <w:color w:val="000000"/>
-      <w:sz w:val="20"/>
+      <w:color w:val="111111"/>
+      <w:sz w:val="17"/>
     </w:rPr>
   </w:style>
   <w:style w:type="paragraph" w:customStyle="1" w:styleId="Figure">
@@ -1135,16 +1155,16 @@
     <w:pPr>
       <w:keepLines/>
       <w:tabs>
-        <w:tab w:pos="4706" w:val="center"/>
-        <w:tab w:pos="9411" w:val="right"/>
+        <w:tab w:pos="5102" w:val="center"/>
+        <w:tab w:pos="10205" w:val="right"/>
       </w:tabs>
-      <w:spacing w:before="80" w:after="120"/>
+      <w:spacing w:lineRule="exact" w:line="246" w:before="86" w:after="114"/>
       <w:jc w:val="left"/>
     </w:pPr>
     <w:rPr>
-      <w:rFonts w:ascii="Times New Roman" w:hAnsi="Times New Roman" w:cs="Times New Roman" w:eastAsia="Times New Roman"/>
-      <w:color w:val="000000"/>
-      <w:sz w:val="21"/>
+      <w:rFonts w:ascii="Source Serif 4" w:hAnsi="Source Serif 4" w:cs="Source Serif 4" w:eastAsia="Source Serif 4"/>
+      <w:color w:val="111111"/>
+      <w:sz w:val="19"/>
     </w:rPr>
   </w:style>
 </w:styles>

</xml_diff>